<commit_message>
Erasmo Carlos: revisão da Parte 1
Co-Authored-By: Claude Opus 5.5 <noreply@anthropic.com>
Claude-Session: https://claude.ai/code/session_01MJjUEEZrxQDEUifKK2vj9g
</commit_message>
<xml_diff>
--- a/roteiros/erasmo-carlos/Erasmo_Parte1.docx
+++ b/roteiros/erasmo-carlos/Erasmo_Parte1.docx
@@ -87,7 +87,7 @@
         <w:rPr>
           <w:color w:val="000000"/>
         </w:rPr>
-        <w:t>Mãe e filho foram morar numa casa de cômodos. Um casarão dividido em quartos, onde várias famílias pobres moravam espremidas, cada uma no seu canto, dividindo o mesmo banheiro e o mesmo corredor.</w:t>
+        <w:t>Mãe e filho foram morar numa casa de cômodos. Um casarão dividido em quartos, onde várias famílias pobres moravam espremidas, cada uma no seu canto.</w:t>
       </w:r>
     </w:p>
     <w:p>
@@ -175,7 +175,7 @@
         <w:rPr>
           <w:color w:val="000000"/>
         </w:rPr>
-        <w:t>Havia uma esquina na Tijuca que ia entrar para a história da música brasileira. A Rua do Matoso.</w:t>
+        <w:t>Havia uma rua na Tijuca que ia entrar para a história da música brasileira. A Rua do Matoso.</w:t>
       </w:r>
     </w:p>
     <w:p>
@@ -183,7 +183,7 @@
         <w:rPr>
           <w:color w:val="000000"/>
         </w:rPr>
-        <w:t>Ali, todo fim de tarde, se juntava uma turma de garotos sem dinheiro e cheios de sonhos. Ficavam num bar da Rua do Matoso, ouvindo rádio, falando de música, inventando planos que pareciam impossíveis.</w:t>
+        <w:t>Ali, todo fim de tarde, se juntava uma turma de garotos sem dinheiro e cheios de sonhos. Ficavam num bar da rua, falando de música e inventando planos que pareciam impossíveis.</w:t>
       </w:r>
     </w:p>
     <w:p>
@@ -247,7 +247,7 @@
         <w:rPr>
           <w:color w:val="C00000"/>
         </w:rPr>
-        <w:t>Esse violão ia mudar o destino do menino sem pai. Só que nenhum daqueles garotos da esquina podia imaginar o que a fama ia cobrar de Erasmo décadas depois. E quem ia pagar a conta mais alta.</w:t>
+        <w:t>Esse violão ia mudar o destino do menino sem pai. Só que nenhum daqueles garotos do Matoso podia imaginar o que a fama ia cobrar de Erasmo décadas depois. E quem ia pagar a conta mais alta.</w:t>
       </w:r>
     </w:p>
     <w:p>
@@ -359,7 +359,7 @@
         <w:rPr>
           <w:color w:val="000000"/>
         </w:rPr>
-        <w:t>Talvez por isso tenham se entendido tão rápido.</w:t>
+        <w:t>Os dois se entenderam logo de cara.</w:t>
       </w:r>
     </w:p>
     <w:p>
@@ -391,7 +391,7 @@
         <w:rPr>
           <w:color w:val="000000"/>
         </w:rPr>
-        <w:t>Os Snakes cantavam onde dava. Festas, programas de rádio, apresentações que quase não pagavam nada.</w:t>
+        <w:t>Os Snakes cantavam onde dava, em festas de bairro e em apresentações que quase não pagavam nada.</w:t>
       </w:r>
     </w:p>
     <w:p>

</xml_diff>

<commit_message>
Erasmo Carlos: Parte 3 e ajuste de 'noite' nas Partes 1 e 2
Co-Authored-By: Claude Opus 5.5 <noreply@anthropic.com>
Claude-Session: https://claude.ai/code/session_01MJjUEEZrxQDEUifKK2vj9g
</commit_message>
<xml_diff>
--- a/roteiros/erasmo-carlos/Erasmo_Parte1.docx
+++ b/roteiros/erasmo-carlos/Erasmo_Parte1.docx
@@ -23,7 +23,7 @@
         <w:rPr>
           <w:color w:val="C00000"/>
         </w:rPr>
-        <w:t>O que pouca gente sabe é que, numa noite, dentro da própria casa, Erasmo ouviu um barulho que mudou a vida dele para sempre. E aquilo foi só o começo.</w:t>
+        <w:t>O que pouca gente sabe é que, um dia, dentro da própria casa, Erasmo ouviu um barulho que mudou a vida dele para sempre. E aquilo foi só o começo.</w:t>
       </w:r>
     </w:p>
     <w:p>
@@ -431,7 +431,7 @@
         <w:rPr>
           <w:color w:val="C00000"/>
         </w:rPr>
-        <w:t>Porque o garoto da Rua do Matoso estava a poucos anos de virar um dos homens mais famosos do país. E, quanto mais alto ele subia, mais perto chegava a noite em que ouviria aquele barulho dentro de casa.</w:t>
+        <w:t>Porque o garoto da Rua do Matoso estava a poucos anos de virar um dos homens mais famosos do país. E, quanto mais alto ele subia, mais perto chegava o dia em que ia ouvir aquele barulho dentro de casa.</w:t>
       </w:r>
     </w:p>
     <w:sectPr>

</xml_diff>